<commit_message>
Add comparables re-based to 2026 dollars and a New York distribution-scale cohort (slides 12-13, workbook tab, memo 3.1-3.2)
Answers two review comments: the filing-derived comparables were nominal, and New York has built many more projects of this size (NineDot Energy). A two-component model deflates each comparable's battery share on a chosen index and escalates the rest; the reference-class median moves 4% at the installed index and Hyde Park's percentile does not move. NYCIDA filings supply all-in costs for NineDot Arthur Kill Road, Elevate Victory Boulevard and Soltage Maspeth; NYSERDA program averages and the Con Edison two-part-test interconnection figures complete the cohort. Deck grows to 26 slides; workbook gains a 2026$ Adjustment tab with live formulas (zero errors); memo gains sections 3.1 and 3.2.

Co-Authored-By: Claude Fable 5.1 <noreply@anthropic.com>
Claude-Session: https://claude.ai/code/session_01YAU7MDk5K6GEm6c4td5TUq
</commit_message>
<xml_diff>
--- a/Hyde Park BESS/6) Cost Analysis Deliverables/Hyde Park BESS - Statistical Benchmarking Memo.docx
+++ b/Hyde Park BESS/6) Cost Analysis Deliverables/Hyde Park BESS - Statistical Benchmarking Memo.docx
@@ -5178,6 +5178,58 @@
     </w:p>
     <w:p>
       <w:pPr>
+        <w:pStyle w:val="Heading2"/>
+      </w:pPr>
+      <w:r>
+        <w:t>3.1 Dollar-year adjustment (added 2 October 2026)</w:t>
+      </w:r>
+    </w:p>
+    <w:p>
+      <w:pPr>
+        <w:spacing w:after="120"/>
+      </w:pPr>
+      <w:r>
+        <w:rPr>
+          <w:b w:val="0"/>
+          <w:i w:val="0"/>
+        </w:rPr>
+        <w:t>The reference class above is in nominal dollars of the year each cost was reported, and nine of its thirteen members entered service between 2015 and 2019. A reviewer asked whether that understates the gap, given that battery prices were several times higher in 2018. The answer depends on which price is meant. BloombergNEF's pack survey is 1.6 times its 2018 level and 3.4 times its 2015 level; installed systems moved less (EIA's reported all-in for 2018 installs was $625 per kWh against LBNL's $458 for 2024, a factor of 1.4); and Lazard's Levelized Cost of Storage, which some reviewers cite, is roughly flat, down 24 percent from 2019 to 2025 and up 31 percent from 2020 to 2026 on the midpoint of its unsubsidized 100 MW, four-hour range. LCOS is in any case a $/MWh figure that bundles charging energy, operations, augmentation, financing and tax credits with capital cost, and is not a capital-cost deflator.</w:t>
+      </w:r>
+    </w:p>
+    <w:p>
+      <w:pPr>
+        <w:spacing w:after="120"/>
+      </w:pPr>
+      <w:r>
+        <w:rPr>
+          <w:b w:val="0"/>
+          <w:i w:val="0"/>
+        </w:rPr>
+        <w:t>Each comparable was re-based to 2026 with a two-component model: the battery share of its cost (40 percent, with 30 and 50 percent as sensitivities) deflated along a battery index, and the remainder (station, civil, labor, interconnection, overheads) escalated at 3.5 percent a year as a proxy for an ENR-class construction index. Under the installed all-in index the median moves from $1,235 to $1,187 per kWh; under the pack index to $1,225; under BNEF's turnkey series (available from 2022 only) to $1,074; under the LCOS midpoint to $1,466; and with construction escalation alone to $1,480. Every member moves between 0.95 and 1.09 times its nominal value at the installed index. Hyde Park's station-complete direct cost ($1,483) stays at the 77th percentile under the first three indices and falls to the 54th under LCOS; the approval level ($2,862) stays at or above the top under all five. Deflating a comparable's whole cost at the battery rate, which is the arithmetic behind the challenge, gives a median of $575 and treats a 2019 project's switchgear, civil works and interconnection as if they were lithium cells. The formulas are on the workbook tab '2026$ Adjustment'.</w:t>
+      </w:r>
+    </w:p>
+    <w:p>
+      <w:pPr>
+        <w:pStyle w:val="Heading2"/>
+      </w:pPr>
+      <w:r>
+        <w:t>3.2 New York distribution-scale cohort</w:t>
+      </w:r>
+    </w:p>
+    <w:p>
+      <w:pPr>
+        <w:spacing w:after="120"/>
+      </w:pPr>
+      <w:r>
+        <w:rPr>
+          <w:b w:val="0"/>
+          <w:i w:val="0"/>
+        </w:rPr>
+        <w:t>A second review comment noted that New York has built many more projects of this size, most of them by NineDot Energy. NineDot reports eleven operating projects at six New York City sites (39 MW, September 2026) and closed $431 million of construction, tax-credit bridge and letter-of-credit financing in February 2026 for 28 further sites totaling 124 MW and 494 MWh. Three New York City Industrial Development Agency filings disclose all-in project costs: NineDot's Arthur Kill Road site (9.8 MW, 39.1 MWh, $43.4 million, $1,110 per kWh, $4,427 per kW), Elevate Renewables' Victory Boulevard site at an existing generation property (15.1 MW, 60.4 MWh, $31.65 million, $524 per kWh) and Soltage's Maspeth site (5 MW, $16.1 million, $805 per kWh on an assumed four-hour duration). NYSERDA's 6 GW Roadmap reports average total installed costs for its retail-tier (5 MW and below) projects of $464 per kWh for 2020-21 installations and $567 for 2022-23. These are developer-owned, four-hour, distribution-connected sites on leased lots with VDER revenue, a NYSERDA incentive and the investment tax credit; none carries a utility switching station, a landfill platform, a siting case, utility indirects or AFUDC, and none of the figures nets the incentives. On a dollar-per-kW basis NineDot's own filed budget is 77 percent of Hyde Park's approval level and 1.5 times its station-complete direct cost. The cohort also illustrates the interconnection point: NY-BEST and NYSEIA told the Public Service Commission on 11 March 2026 (Case 24-E-0621) that Con Edison's two-part interconnection test had raised upgrade costs about fourteen-fold on 34 distributed projects totaling 161 MW, an average of about $21 million per project. The cohort is shown on deck slide 13 and on the workbook tab; it was not added to the regression, which was not re-run.</w:t>
+      </w:r>
+    </w:p>
+    <w:p>
+      <w:pPr>
         <w:pStyle w:val="Heading1"/>
       </w:pPr>
       <w:r>

</xml_diff>

<commit_message>
Add the three NYCIDA-costed New York projects to the regression dataset and re-run the model (n = 29)
Size elasticity unchanged at -0.17 (p 0.012 to 0.001), duration -0.29, year insignificant, R-squared 0.645 to 0.629. Prediction for 20 MWh / 2-h / 2028 moves from $1,116 to $1,114/kWh; 80% interval narrows from $611-$2,037 to $652-$1,903. Hyde Park station-direct percentile 73% to 75%. Appendix B, memo sections 2 and 3.2, workbook Public Projects and Statistics tabs, README and research log updated; the financing floor and NYSERDA averages were not added because they are not project costs.

Co-Authored-By: Claude Fable 5.1 <noreply@anthropic.com>
Claude-Session: https://claude.ai/code/session_01YAU7MDk5K6GEm6c4td5TUq
</commit_message>
<xml_diff>
--- a/Hyde Park BESS/6) Cost Analysis Deliverables/Hyde Park BESS - Statistical Benchmarking Memo.docx
+++ b/Hyde Park BESS/6) Cost Analysis Deliverables/Hyde Park BESS - Statistical Benchmarking Memo.docx
@@ -96,7 +96,7 @@
               <w:rPr>
                 <w:sz w:val="20"/>
               </w:rPr>
-              <w:t>A 20 MWh, two-hour project in 2028 is predicted at $1,116/kWh with an 80 percent prediction interval of $611 to $2,037/kWh. Hyde Park's station-complete direct cost of $1,483/kWh sits at the 73% percentile of that interval and at the 77% percentile of the reference class; its installed battery at $833/kWh sits at the 27% and 38% percentiles. The approval level of $2,862/kWh is above every project in the reference class, and the reasons are named: a separate 13.8 kV switching station, a feeder protection program at Station 496, a landfill platform, and $23.7 million of risk, contingency, indirects and AFUDC that most disclosed project costs do not carry. The Monte Carlo puts the P80 total at $53.0M on base element ranges and $55.9M on Class 5-like ranges, against a $57.2M approval level that carries $7.6M of risk and contingency; the reserve covers the element ranges as modeled and is thin against the 9 to 64 percent estimate-to-actual uplifts observed on comparable small utility projects. The element ranges assume the Haugland reconciliation does not move the construction base; the red team's expectation is that it will.</w:t>
+              <w:t>A 20 MWh, two-hour project in 2028 is predicted at $1,114/kWh with an 80 percent prediction interval of $652 to $1,903/kWh. Hyde Park's station-complete direct cost of $1,483/kWh sits at the 75% percentile of that interval and at the 77% percentile of the reference class; its installed battery at $833/kWh sits at the 24% and 38% percentiles. The approval level of $2,862/kWh is above every project in the reference class, and the reasons are named: a separate 13.8 kV switching station, a feeder protection program at Station 496, a landfill platform, and $23.7 million of risk, contingency, indirects and AFUDC that most disclosed project costs do not carry. The Monte Carlo puts the P80 total at $53.0M on base element ranges and $55.9M on Class 5-like ranges, against a $57.2M approval level that carries $7.6M of risk and contingency; the reserve covers the element ranges as modeled and is thin against the 9 to 64 percent estimate-to-actual uplifts observed on comparable small utility projects. The element ranges assume the Haugland reconciliation does not move the construction base; the red team's expectation is that it will.</w:t>
             </w:r>
           </w:p>
         </w:tc>
@@ -156,7 +156,7 @@
           <w:b w:val="0"/>
           <w:i w:val="0"/>
         </w:rPr>
-        <w:t>Forty-four projects with a disclosed cost, capacity and energy were compiled from regulator orders, utility releases, 10-K filings and trade press (sourcing in the companion research log). Ten were excluded for bundled or non-capital scope: Nantucket (15 MW diesel generator), Salem Smart Power Center (2013 demonstration with building and controls), Arlington and Hot Springs (microgrids with solar), Essex and SwRI (solar bundled), Leighton Buzzard (R&amp;D trials), Glenarm (a fifteen-year service contract, not capital), the Xcel Minnesota program budget, and Morro Bay (proposed, no date). Eight more lack a confirmed MWh or year and drop out of the fit. The 26 that remain span 3 to 2,150 MWh, 0.25 to 6.5 hours, 2015 to 2027, and $368 to $2,775 per kWh, nominal dollars in the year reported.</w:t>
+        <w:t>Forty-seven projects with a disclosed cost, capacity and energy were compiled (forty-four on 29 September 2026 and three New York City Industrial Development Agency filings on 2 October 2026) from regulator orders, utility releases, 10-K filings and trade press (sourcing in the companion research log). Ten were excluded for bundled or non-capital scope: Nantucket (15 MW diesel generator), Salem Smart Power Center (2013 demonstration with building and controls), Arlington and Hot Springs (microgrids with solar), Essex and SwRI (solar bundled), Leighton Buzzard (R&amp;D trials), Glenarm (a fifteen-year service contract, not capital), the Xcel Minnesota program budget, and Morro Bay (proposed, no date). Eight more lack a confirmed MWh or year and drop out of the fit. The 29 that remain span 3 to 2,150 MWh, 0.25 to 6.5 hours, 2015 to 2027, and $368 to $2,775 per kWh, nominal dollars in the year reported.</w:t>
       </w:r>
     </w:p>
     <w:tbl>
@@ -2575,7 +2575,7 @@
                 <w:i w:val="0"/>
                 <w:sz w:val="15"/>
               </w:rPr>
-              <w:t>Outer Cape (Provincetown) BESS</w:t>
+              <w:t>Soltage Brigis 1A BESS (Maspeth, Queens)</w:t>
             </w:r>
           </w:p>
         </w:tc>
@@ -2594,7 +2594,7 @@
                 <w:i w:val="0"/>
                 <w:sz w:val="15"/>
               </w:rPr>
-              <w:t>MA</w:t>
+              <w:t>NY</w:t>
             </w:r>
           </w:p>
         </w:tc>
@@ -2614,7 +2614,7 @@
                 <w:i w:val="0"/>
                 <w:sz w:val="15"/>
               </w:rPr>
-              <w:t>25</w:t>
+              <w:t>5</w:t>
             </w:r>
           </w:p>
         </w:tc>
@@ -2634,7 +2634,7 @@
                 <w:i w:val="0"/>
                 <w:sz w:val="15"/>
               </w:rPr>
-              <w:t>38</w:t>
+              <w:t>20</w:t>
             </w:r>
           </w:p>
         </w:tc>
@@ -2654,7 +2654,7 @@
                 <w:i w:val="0"/>
                 <w:sz w:val="15"/>
               </w:rPr>
-              <w:t>2022</w:t>
+              <w:t>2025</w:t>
             </w:r>
           </w:p>
         </w:tc>
@@ -2674,7 +2674,7 @@
                 <w:i w:val="0"/>
                 <w:sz w:val="15"/>
               </w:rPr>
-              <w:t>$49.0M</w:t>
+              <w:t>$16.1M</w:t>
             </w:r>
           </w:p>
         </w:tc>
@@ -2694,7 +2694,7 @@
                 <w:i w:val="0"/>
                 <w:sz w:val="15"/>
               </w:rPr>
-              <w:t>$1,289</w:t>
+              <w:t>$805</w:t>
             </w:r>
           </w:p>
         </w:tc>
@@ -2713,7 +2713,7 @@
                 <w:i w:val="0"/>
                 <w:sz w:val="15"/>
               </w:rPr>
-              <w:t>final/actual (as reported)</w:t>
+              <w:t xml:space="preserve">NYCIDA total project cost (public </w:t>
             </w:r>
           </w:p>
         </w:tc>
@@ -2754,7 +2754,7 @@
                 <w:i w:val="0"/>
                 <w:sz w:val="15"/>
               </w:rPr>
-              <w:t>Martha's Vineyard BESS Phase 2 (cancelled)</w:t>
+              <w:t>Outer Cape (Provincetown) BESS</w:t>
             </w:r>
           </w:p>
         </w:tc>
@@ -2795,7 +2795,7 @@
                 <w:i w:val="0"/>
                 <w:sz w:val="15"/>
               </w:rPr>
-              <w:t>9</w:t>
+              <w:t>25</w:t>
             </w:r>
           </w:p>
         </w:tc>
@@ -2816,7 +2816,7 @@
                 <w:i w:val="0"/>
                 <w:sz w:val="15"/>
               </w:rPr>
-              <w:t>64</w:t>
+              <w:t>38</w:t>
             </w:r>
           </w:p>
         </w:tc>
@@ -2837,7 +2837,7 @@
                 <w:i w:val="0"/>
                 <w:sz w:val="15"/>
               </w:rPr>
-              <w:t>2019</w:t>
+              <w:t>2022</w:t>
             </w:r>
           </w:p>
         </w:tc>
@@ -2858,7 +2858,7 @@
                 <w:i w:val="0"/>
                 <w:sz w:val="15"/>
               </w:rPr>
-              <w:t>$28.0M</w:t>
+              <w:t>$49.0M</w:t>
             </w:r>
           </w:p>
         </w:tc>
@@ -2879,7 +2879,7 @@
                 <w:i w:val="0"/>
                 <w:sz w:val="15"/>
               </w:rPr>
-              <w:t>$438</w:t>
+              <w:t>$1,289</w:t>
             </w:r>
           </w:p>
         </w:tc>
@@ -2899,7 +2899,7 @@
                 <w:i w:val="0"/>
                 <w:sz w:val="15"/>
               </w:rPr>
-              <w:t>estimate (DPU 18-155 filing)</w:t>
+              <w:t>final/actual (as reported)</w:t>
             </w:r>
           </w:p>
         </w:tc>
@@ -2940,7 +2940,7 @@
                 <w:i w:val="0"/>
                 <w:sz w:val="15"/>
               </w:rPr>
-              <w:t>Chugach BESS (Southcentral Power Project sit</w:t>
+              <w:t>NineDot Arthur Kill Road BESS (Staten Island</w:t>
             </w:r>
           </w:p>
         </w:tc>
@@ -2959,7 +2959,7 @@
                 <w:i w:val="0"/>
                 <w:sz w:val="15"/>
               </w:rPr>
-              <w:t>AK</w:t>
+              <w:t>NY</w:t>
             </w:r>
           </w:p>
         </w:tc>
@@ -2979,7 +2979,7 @@
                 <w:i w:val="0"/>
                 <w:sz w:val="15"/>
               </w:rPr>
-              <w:t>40</w:t>
+              <w:t>9</w:t>
             </w:r>
           </w:p>
         </w:tc>
@@ -2999,7 +2999,7 @@
                 <w:i w:val="0"/>
                 <w:sz w:val="15"/>
               </w:rPr>
-              <w:t>80</w:t>
+              <w:t>39</w:t>
             </w:r>
           </w:p>
         </w:tc>
@@ -3019,7 +3019,7 @@
                 <w:i w:val="0"/>
                 <w:sz w:val="15"/>
               </w:rPr>
-              <w:t>2024</w:t>
+              <w:t>2025</w:t>
             </w:r>
           </w:p>
         </w:tc>
@@ -3039,7 +3039,7 @@
                 <w:i w:val="0"/>
                 <w:sz w:val="15"/>
               </w:rPr>
-              <w:t>$65.0M</w:t>
+              <w:t>$43.4M</w:t>
             </w:r>
           </w:p>
         </w:tc>
@@ -3059,7 +3059,7 @@
                 <w:i w:val="0"/>
                 <w:sz w:val="15"/>
               </w:rPr>
-              <w:t>$812</w:t>
+              <w:t>$1,110</w:t>
             </w:r>
           </w:p>
         </w:tc>
@@ -3078,7 +3078,7 @@
                 <w:i w:val="0"/>
                 <w:sz w:val="15"/>
               </w:rPr>
-              <w:t>final/actual (as reported)</w:t>
+              <w:t xml:space="preserve">NYCIDA project budget (inducement </w:t>
             </w:r>
           </w:p>
         </w:tc>
@@ -3119,7 +3119,7 @@
                 <w:i w:val="0"/>
                 <w:sz w:val="15"/>
               </w:rPr>
-              <w:t>Waena BESS (Maui)</w:t>
+              <w:t>Elevate Renewables Victory Blvd BESS (Staten</w:t>
             </w:r>
           </w:p>
         </w:tc>
@@ -3139,7 +3139,7 @@
                 <w:i w:val="0"/>
                 <w:sz w:val="15"/>
               </w:rPr>
-              <w:t>HI</w:t>
+              <w:t>NY</w:t>
             </w:r>
           </w:p>
         </w:tc>
@@ -3160,7 +3160,7 @@
                 <w:i w:val="0"/>
                 <w:sz w:val="15"/>
               </w:rPr>
-              <w:t>40</w:t>
+              <w:t>15</w:t>
             </w:r>
           </w:p>
         </w:tc>
@@ -3181,7 +3181,7 @@
                 <w:i w:val="0"/>
                 <w:sz w:val="15"/>
               </w:rPr>
-              <w:t>160</w:t>
+              <w:t>60</w:t>
             </w:r>
           </w:p>
         </w:tc>
@@ -3202,7 +3202,7 @@
                 <w:i w:val="0"/>
                 <w:sz w:val="15"/>
               </w:rPr>
-              <w:t>2027</w:t>
+              <w:t>2025</w:t>
             </w:r>
           </w:p>
         </w:tc>
@@ -3223,7 +3223,7 @@
                 <w:i w:val="0"/>
                 <w:sz w:val="15"/>
               </w:rPr>
-              <w:t>$82.1M</w:t>
+              <w:t>$31.6M</w:t>
             </w:r>
           </w:p>
         </w:tc>
@@ -3244,7 +3244,7 @@
                 <w:i w:val="0"/>
                 <w:sz w:val="15"/>
               </w:rPr>
-              <w:t>$513</w:t>
+              <w:t>$524</w:t>
             </w:r>
           </w:p>
         </w:tc>
@@ -3264,7 +3264,7 @@
                 <w:i w:val="0"/>
                 <w:sz w:val="15"/>
               </w:rPr>
-              <w:t>approved budget/estimate (HPUC Dec</w:t>
+              <w:t xml:space="preserve">NYCIDA total project cost (public </w:t>
             </w:r>
           </w:p>
         </w:tc>
@@ -3305,7 +3305,7 @@
                 <w:i w:val="0"/>
                 <w:sz w:val="15"/>
               </w:rPr>
-              <w:t>Kwinana BESS Stage 1 [AUSTRALIA]</w:t>
+              <w:t>Martha's Vineyard BESS Phase 2 (cancelled)</w:t>
             </w:r>
           </w:p>
         </w:tc>
@@ -3324,7 +3324,7 @@
                 <w:i w:val="0"/>
                 <w:sz w:val="15"/>
               </w:rPr>
-              <w:t>WA (Australia)</w:t>
+              <w:t>MA</w:t>
             </w:r>
           </w:p>
         </w:tc>
@@ -3344,7 +3344,7 @@
                 <w:i w:val="0"/>
                 <w:sz w:val="15"/>
               </w:rPr>
-              <w:t>100</w:t>
+              <w:t>9</w:t>
             </w:r>
           </w:p>
         </w:tc>
@@ -3364,7 +3364,7 @@
                 <w:i w:val="0"/>
                 <w:sz w:val="15"/>
               </w:rPr>
-              <w:t>200</w:t>
+              <w:t>64</w:t>
             </w:r>
           </w:p>
         </w:tc>
@@ -3384,7 +3384,7 @@
                 <w:i w:val="0"/>
                 <w:sz w:val="15"/>
               </w:rPr>
-              <w:t>2023</w:t>
+              <w:t>2019</w:t>
             </w:r>
           </w:p>
         </w:tc>
@@ -3404,7 +3404,7 @@
                 <w:i w:val="0"/>
                 <w:sz w:val="15"/>
               </w:rPr>
-              <w:t>$103.5M</w:t>
+              <w:t>$28.0M</w:t>
             </w:r>
           </w:p>
         </w:tc>
@@ -3424,7 +3424,7 @@
                 <w:i w:val="0"/>
                 <w:sz w:val="15"/>
               </w:rPr>
-              <w:t>$518</w:t>
+              <w:t>$438</w:t>
             </w:r>
           </w:p>
         </w:tc>
@@ -3443,7 +3443,7 @@
                 <w:i w:val="0"/>
                 <w:sz w:val="15"/>
               </w:rPr>
-              <w:t>final (as reported)</w:t>
+              <w:t>estimate (DPU 18-155 filing)</w:t>
             </w:r>
           </w:p>
         </w:tc>
@@ -3484,7 +3484,7 @@
                 <w:i w:val="0"/>
                 <w:sz w:val="15"/>
               </w:rPr>
-              <w:t>Constable (Evergreen) BESS</w:t>
+              <w:t>Chugach BESS (Southcentral Power Project sit</w:t>
             </w:r>
           </w:p>
         </w:tc>
@@ -3504,7 +3504,7 @@
                 <w:i w:val="0"/>
                 <w:sz w:val="15"/>
               </w:rPr>
-              <w:t>OR</w:t>
+              <w:t>AK</w:t>
             </w:r>
           </w:p>
         </w:tc>
@@ -3525,7 +3525,7 @@
                 <w:i w:val="0"/>
                 <w:sz w:val="15"/>
               </w:rPr>
-              <w:t>75</w:t>
+              <w:t>40</w:t>
             </w:r>
           </w:p>
         </w:tc>
@@ -3546,7 +3546,7 @@
                 <w:i w:val="0"/>
                 <w:sz w:val="15"/>
               </w:rPr>
-              <w:t>300</w:t>
+              <w:t>80</w:t>
             </w:r>
           </w:p>
         </w:tc>
@@ -3588,7 +3588,7 @@
                 <w:i w:val="0"/>
                 <w:sz w:val="15"/>
               </w:rPr>
-              <w:t>$156.0M</w:t>
+              <w:t>$65.0M</w:t>
             </w:r>
           </w:p>
         </w:tc>
@@ -3609,7 +3609,7 @@
                 <w:i w:val="0"/>
                 <w:sz w:val="15"/>
               </w:rPr>
-              <w:t>$520</w:t>
+              <w:t>$812</w:t>
             </w:r>
           </w:p>
         </w:tc>
@@ -3629,7 +3629,7 @@
                 <w:i w:val="0"/>
                 <w:sz w:val="15"/>
               </w:rPr>
-              <w:t>final/actual (Electric Utility Pla</w:t>
+              <w:t>final/actual (as reported)</w:t>
             </w:r>
           </w:p>
         </w:tc>
@@ -3670,7 +3670,7 @@
                 <w:i w:val="0"/>
                 <w:sz w:val="15"/>
               </w:rPr>
-              <w:t>Reid Gardner BESS</w:t>
+              <w:t>Waena BESS (Maui)</w:t>
             </w:r>
           </w:p>
         </w:tc>
@@ -3689,7 +3689,7 @@
                 <w:i w:val="0"/>
                 <w:sz w:val="15"/>
               </w:rPr>
-              <w:t>NV</w:t>
+              <w:t>HI</w:t>
             </w:r>
           </w:p>
         </w:tc>
@@ -3709,7 +3709,7 @@
                 <w:i w:val="0"/>
                 <w:sz w:val="15"/>
               </w:rPr>
-              <w:t>220</w:t>
+              <w:t>40</w:t>
             </w:r>
           </w:p>
         </w:tc>
@@ -3729,7 +3729,7 @@
                 <w:i w:val="0"/>
                 <w:sz w:val="15"/>
               </w:rPr>
-              <w:t>440</w:t>
+              <w:t>160</w:t>
             </w:r>
           </w:p>
         </w:tc>
@@ -3749,7 +3749,7 @@
                 <w:i w:val="0"/>
                 <w:sz w:val="15"/>
               </w:rPr>
-              <w:t>2023</w:t>
+              <w:t>2027</w:t>
             </w:r>
           </w:p>
         </w:tc>
@@ -3769,7 +3769,7 @@
                 <w:i w:val="0"/>
                 <w:sz w:val="15"/>
               </w:rPr>
-              <w:t>$257.0M</w:t>
+              <w:t>$82.1M</w:t>
             </w:r>
           </w:p>
         </w:tc>
@@ -3789,7 +3789,7 @@
                 <w:i w:val="0"/>
                 <w:sz w:val="15"/>
               </w:rPr>
-              <w:t>$584</w:t>
+              <w:t>$513</w:t>
             </w:r>
           </w:p>
         </w:tc>
@@ -3808,7 +3808,7 @@
                 <w:i w:val="0"/>
                 <w:sz w:val="15"/>
               </w:rPr>
-              <w:t>final/actual (as reported)</w:t>
+              <w:t>approved budget/estimate (HPUC Dec</w:t>
             </w:r>
           </w:p>
         </w:tc>
@@ -3827,7 +3827,7 @@
                 <w:i w:val="0"/>
                 <w:sz w:val="15"/>
               </w:rPr>
-              <w:t>Medium</w:t>
+              <w:t>High</w:t>
             </w:r>
           </w:p>
         </w:tc>
@@ -3849,7 +3849,7 @@
                 <w:i w:val="0"/>
                 <w:sz w:val="15"/>
               </w:rPr>
-              <w:t>Nova Scotia BESS portfolio (Bridgewater, Wav</w:t>
+              <w:t>Kwinana BESS Stage 1 [AUSTRALIA]</w:t>
             </w:r>
           </w:p>
         </w:tc>
@@ -3869,7 +3869,7 @@
                 <w:i w:val="0"/>
                 <w:sz w:val="15"/>
               </w:rPr>
-              <w:t>NS (Canada)</w:t>
+              <w:t>WA (Australia)</w:t>
             </w:r>
           </w:p>
         </w:tc>
@@ -3890,7 +3890,7 @@
                 <w:i w:val="0"/>
                 <w:sz w:val="15"/>
               </w:rPr>
-              <w:t>150</w:t>
+              <w:t>100</w:t>
             </w:r>
           </w:p>
         </w:tc>
@@ -3911,7 +3911,7 @@
                 <w:i w:val="0"/>
                 <w:sz w:val="15"/>
               </w:rPr>
-              <w:t>600</w:t>
+              <w:t>200</w:t>
             </w:r>
           </w:p>
         </w:tc>
@@ -3932,7 +3932,7 @@
                 <w:i w:val="0"/>
                 <w:sz w:val="15"/>
               </w:rPr>
-              <w:t>2026</w:t>
+              <w:t>2023</w:t>
             </w:r>
           </w:p>
         </w:tc>
@@ -3953,7 +3953,7 @@
                 <w:i w:val="0"/>
                 <w:sz w:val="15"/>
               </w:rPr>
-              <w:t>$258.0M</w:t>
+              <w:t>$103.5M</w:t>
             </w:r>
           </w:p>
         </w:tc>
@@ -3974,7 +3974,7 @@
                 <w:i w:val="0"/>
                 <w:sz w:val="15"/>
               </w:rPr>
-              <w:t>$430</w:t>
+              <w:t>$518</w:t>
             </w:r>
           </w:p>
         </w:tc>
@@ -3994,7 +3994,7 @@
                 <w:i w:val="0"/>
                 <w:sz w:val="15"/>
               </w:rPr>
-              <w:t>approved budget (NSUARB) incl. AFU</w:t>
+              <w:t>final (as reported)</w:t>
             </w:r>
           </w:p>
         </w:tc>
@@ -4014,7 +4014,7 @@
                 <w:i w:val="0"/>
                 <w:sz w:val="15"/>
               </w:rPr>
-              <w:t>High</w:t>
+              <w:t>Medium</w:t>
             </w:r>
           </w:p>
         </w:tc>
@@ -4035,7 +4035,7 @@
                 <w:i w:val="0"/>
                 <w:sz w:val="15"/>
               </w:rPr>
-              <w:t>Seaside BESS</w:t>
+              <w:t>Constable (Evergreen) BESS</w:t>
             </w:r>
           </w:p>
         </w:tc>
@@ -4074,7 +4074,7 @@
                 <w:i w:val="0"/>
                 <w:sz w:val="15"/>
               </w:rPr>
-              <w:t>200</w:t>
+              <w:t>75</w:t>
             </w:r>
           </w:p>
         </w:tc>
@@ -4094,7 +4094,7 @@
                 <w:i w:val="0"/>
                 <w:sz w:val="15"/>
               </w:rPr>
-              <w:t>800</w:t>
+              <w:t>300</w:t>
             </w:r>
           </w:p>
         </w:tc>
@@ -4114,7 +4114,7 @@
                 <w:i w:val="0"/>
                 <w:sz w:val="15"/>
               </w:rPr>
-              <w:t>2025</w:t>
+              <w:t>2024</w:t>
             </w:r>
           </w:p>
         </w:tc>
@@ -4134,7 +4134,7 @@
                 <w:i w:val="0"/>
                 <w:sz w:val="15"/>
               </w:rPr>
-              <w:t>$360.0M</w:t>
+              <w:t>$156.0M</w:t>
             </w:r>
           </w:p>
         </w:tc>
@@ -4154,7 +4154,7 @@
                 <w:i w:val="0"/>
                 <w:sz w:val="15"/>
               </w:rPr>
-              <w:t>$450</w:t>
+              <w:t>$520</w:t>
             </w:r>
           </w:p>
         </w:tc>
@@ -4173,7 +4173,7 @@
                 <w:i w:val="0"/>
                 <w:sz w:val="15"/>
               </w:rPr>
-              <w:t>contract price (fixed-cost build-t</w:t>
+              <w:t>final/actual (Electric Utility Pla</w:t>
             </w:r>
           </w:p>
         </w:tc>
@@ -4214,7 +4214,7 @@
                 <w:i w:val="0"/>
                 <w:sz w:val="15"/>
               </w:rPr>
-              <w:t>Roadrunner Reserve (Phase 1)</w:t>
+              <w:t>Reid Gardner BESS</w:t>
             </w:r>
           </w:p>
         </w:tc>
@@ -4234,7 +4234,7 @@
                 <w:i w:val="0"/>
                 <w:sz w:val="15"/>
               </w:rPr>
-              <w:t>AZ</w:t>
+              <w:t>NV</w:t>
             </w:r>
           </w:p>
         </w:tc>
@@ -4255,7 +4255,7 @@
                 <w:i w:val="0"/>
                 <w:sz w:val="15"/>
               </w:rPr>
-              <w:t>200</w:t>
+              <w:t>220</w:t>
             </w:r>
           </w:p>
         </w:tc>
@@ -4276,7 +4276,7 @@
                 <w:i w:val="0"/>
                 <w:sz w:val="15"/>
               </w:rPr>
-              <w:t>800</w:t>
+              <w:t>440</w:t>
             </w:r>
           </w:p>
         </w:tc>
@@ -4297,7 +4297,7 @@
                 <w:i w:val="0"/>
                 <w:sz w:val="15"/>
               </w:rPr>
-              <w:t>2025</w:t>
+              <w:t>2023</w:t>
             </w:r>
           </w:p>
         </w:tc>
@@ -4318,7 +4318,7 @@
                 <w:i w:val="0"/>
                 <w:sz w:val="15"/>
               </w:rPr>
-              <w:t>$294.0M</w:t>
+              <w:t>$257.0M</w:t>
             </w:r>
           </w:p>
         </w:tc>
@@ -4339,7 +4339,7 @@
                 <w:i w:val="0"/>
                 <w:sz w:val="15"/>
               </w:rPr>
-              <w:t>$368</w:t>
+              <w:t>$584</w:t>
             </w:r>
           </w:p>
         </w:tc>
@@ -4359,7 +4359,7 @@
                 <w:i w:val="0"/>
                 <w:sz w:val="15"/>
               </w:rPr>
-              <w:t>estimate at announcement (2023)</w:t>
+              <w:t>final/actual (as reported)</w:t>
             </w:r>
           </w:p>
         </w:tc>
@@ -4400,7 +4400,7 @@
                 <w:i w:val="0"/>
                 <w:sz w:val="15"/>
               </w:rPr>
-              <w:t>Roadrunner Reserve 2 (Phase 2)</w:t>
+              <w:t>Nova Scotia BESS portfolio (Bridgewater, Wav</w:t>
             </w:r>
           </w:p>
         </w:tc>
@@ -4419,7 +4419,7 @@
                 <w:i w:val="0"/>
                 <w:sz w:val="15"/>
               </w:rPr>
-              <w:t>AZ</w:t>
+              <w:t>NS (Canada)</w:t>
             </w:r>
           </w:p>
         </w:tc>
@@ -4439,7 +4439,7 @@
                 <w:i w:val="0"/>
                 <w:sz w:val="15"/>
               </w:rPr>
-              <w:t>200</w:t>
+              <w:t>150</w:t>
             </w:r>
           </w:p>
         </w:tc>
@@ -4459,7 +4459,7 @@
                 <w:i w:val="0"/>
                 <w:sz w:val="15"/>
               </w:rPr>
-              <w:t>800</w:t>
+              <w:t>600</w:t>
             </w:r>
           </w:p>
         </w:tc>
@@ -4499,7 +4499,7 @@
                 <w:i w:val="0"/>
                 <w:sz w:val="15"/>
               </w:rPr>
-              <w:t>$350.0M</w:t>
+              <w:t>$258.0M</w:t>
             </w:r>
           </w:p>
         </w:tc>
@@ -4519,7 +4519,7 @@
                 <w:i w:val="0"/>
                 <w:sz w:val="15"/>
               </w:rPr>
-              <w:t>$438</w:t>
+              <w:t>$430</w:t>
             </w:r>
           </w:p>
         </w:tc>
@@ -4538,7 +4538,7 @@
                 <w:i w:val="0"/>
                 <w:sz w:val="15"/>
               </w:rPr>
-              <w:t>estimate (utility statement)</w:t>
+              <w:t>approved budget (NSUARB) incl. AFU</w:t>
             </w:r>
           </w:p>
         </w:tc>
@@ -4557,7 +4557,7 @@
                 <w:i w:val="0"/>
                 <w:sz w:val="15"/>
               </w:rPr>
-              <w:t>Medium</w:t>
+              <w:t>High</w:t>
             </w:r>
           </w:p>
         </w:tc>
@@ -4579,7 +4579,7 @@
                 <w:i w:val="0"/>
                 <w:sz w:val="15"/>
               </w:rPr>
-              <w:t>Trenton Channel Energy Center BESS</w:t>
+              <w:t>Seaside BESS</w:t>
             </w:r>
           </w:p>
         </w:tc>
@@ -4599,7 +4599,7 @@
                 <w:i w:val="0"/>
                 <w:sz w:val="15"/>
               </w:rPr>
-              <w:t>MI</w:t>
+              <w:t>OR</w:t>
             </w:r>
           </w:p>
         </w:tc>
@@ -4620,7 +4620,7 @@
                 <w:i w:val="0"/>
                 <w:sz w:val="15"/>
               </w:rPr>
-              <w:t>220</w:t>
+              <w:t>200</w:t>
             </w:r>
           </w:p>
         </w:tc>
@@ -4641,7 +4641,7 @@
                 <w:i w:val="0"/>
                 <w:sz w:val="15"/>
               </w:rPr>
-              <w:t>880</w:t>
+              <w:t>800</w:t>
             </w:r>
           </w:p>
         </w:tc>
@@ -4662,7 +4662,7 @@
                 <w:i w:val="0"/>
                 <w:sz w:val="15"/>
               </w:rPr>
-              <w:t>2026</w:t>
+              <w:t>2025</w:t>
             </w:r>
           </w:p>
         </w:tc>
@@ -4683,7 +4683,7 @@
                 <w:i w:val="0"/>
                 <w:sz w:val="15"/>
               </w:rPr>
-              <w:t>$460.0M</w:t>
+              <w:t>$360.0M</w:t>
             </w:r>
           </w:p>
         </w:tc>
@@ -4704,7 +4704,7 @@
                 <w:i w:val="0"/>
                 <w:sz w:val="15"/>
               </w:rPr>
-              <w:t>$523</w:t>
+              <w:t>$450</w:t>
             </w:r>
           </w:p>
         </w:tc>
@@ -4724,7 +4724,7 @@
                 <w:i w:val="0"/>
                 <w:sz w:val="15"/>
               </w:rPr>
-              <w:t>approved estimate (MPSC, 2024)</w:t>
+              <w:t>contract price (fixed-cost build-t</w:t>
             </w:r>
           </w:p>
         </w:tc>
@@ -4744,7 +4744,7 @@
                 <w:i w:val="0"/>
                 <w:sz w:val="15"/>
               </w:rPr>
-              <w:t>Medium</w:t>
+              <w:t>High</w:t>
             </w:r>
           </w:p>
         </w:tc>
@@ -4765,7 +4765,7 @@
                 <w:i w:val="0"/>
                 <w:sz w:val="15"/>
               </w:rPr>
-              <w:t>Oneida Energy Storage [CANADA]</w:t>
+              <w:t>Roadrunner Reserve (Phase 1)</w:t>
             </w:r>
           </w:p>
         </w:tc>
@@ -4784,7 +4784,7 @@
                 <w:i w:val="0"/>
                 <w:sz w:val="15"/>
               </w:rPr>
-              <w:t>ON (Canada)</w:t>
+              <w:t>AZ</w:t>
             </w:r>
           </w:p>
         </w:tc>
@@ -4804,7 +4804,7 @@
                 <w:i w:val="0"/>
                 <w:sz w:val="15"/>
               </w:rPr>
-              <w:t>250</w:t>
+              <w:t>200</w:t>
             </w:r>
           </w:p>
         </w:tc>
@@ -4824,7 +4824,7 @@
                 <w:i w:val="0"/>
                 <w:sz w:val="15"/>
               </w:rPr>
-              <w:t>1000</w:t>
+              <w:t>800</w:t>
             </w:r>
           </w:p>
         </w:tc>
@@ -4864,7 +4864,7 @@
                 <w:i w:val="0"/>
                 <w:sz w:val="15"/>
               </w:rPr>
-              <w:t>$511.0M</w:t>
+              <w:t>$294.0M</w:t>
             </w:r>
           </w:p>
         </w:tc>
@@ -4884,7 +4884,7 @@
                 <w:i w:val="0"/>
                 <w:sz w:val="15"/>
               </w:rPr>
-              <w:t>$511</w:t>
+              <w:t>$368</w:t>
             </w:r>
           </w:p>
         </w:tc>
@@ -4903,7 +4903,7 @@
                 <w:i w:val="0"/>
                 <w:sz w:val="15"/>
               </w:rPr>
-              <w:t xml:space="preserve">final/actual (reported ~C$700M vs </w:t>
+              <w:t>estimate at announcement (2023)</w:t>
             </w:r>
           </w:p>
         </w:tc>
@@ -4922,7 +4922,7 @@
                 <w:i w:val="0"/>
                 <w:sz w:val="15"/>
               </w:rPr>
-              <w:t>High</w:t>
+              <w:t>Medium</w:t>
             </w:r>
           </w:p>
         </w:tc>
@@ -4944,7 +4944,7 @@
                 <w:i w:val="0"/>
                 <w:sz w:val="15"/>
               </w:rPr>
-              <w:t>SCE substation BESS portfolio (Springvale 22</w:t>
+              <w:t>Roadrunner Reserve 2 (Phase 2)</w:t>
             </w:r>
           </w:p>
         </w:tc>
@@ -4964,7 +4964,7 @@
                 <w:i w:val="0"/>
                 <w:sz w:val="15"/>
               </w:rPr>
-              <w:t>CA</w:t>
+              <w:t>AZ</w:t>
             </w:r>
           </w:p>
         </w:tc>
@@ -4985,7 +4985,7 @@
                 <w:i w:val="0"/>
                 <w:sz w:val="15"/>
               </w:rPr>
-              <w:t>537</w:t>
+              <w:t>200</w:t>
             </w:r>
           </w:p>
         </w:tc>
@@ -5006,7 +5006,7 @@
                 <w:i w:val="0"/>
                 <w:sz w:val="15"/>
               </w:rPr>
-              <w:t>2150</w:t>
+              <w:t>800</w:t>
             </w:r>
           </w:p>
         </w:tc>
@@ -5027,7 +5027,7 @@
                 <w:i w:val="0"/>
                 <w:sz w:val="15"/>
               </w:rPr>
-              <w:t>2022</w:t>
+              <w:t>2026</w:t>
             </w:r>
           </w:p>
         </w:tc>
@@ -5048,7 +5048,7 @@
                 <w:i w:val="0"/>
                 <w:sz w:val="15"/>
               </w:rPr>
-              <w:t>$1,226.0M</w:t>
+              <w:t>$350.0M</w:t>
             </w:r>
           </w:p>
         </w:tc>
@@ -5069,7 +5069,7 @@
                 <w:i w:val="0"/>
                 <w:sz w:val="15"/>
               </w:rPr>
-              <w:t>$570</w:t>
+              <w:t>$438</w:t>
             </w:r>
           </w:p>
         </w:tc>
@@ -5089,7 +5089,7 @@
                 <w:i w:val="0"/>
                 <w:sz w:val="15"/>
               </w:rPr>
-              <w:t>contract price (EPCM contract, CPU</w:t>
+              <w:t>estimate (utility statement)</w:t>
             </w:r>
           </w:p>
         </w:tc>
@@ -5097,6 +5097,549 @@
           <w:tcPr>
             <w:tcW w:type="dxa" w:w="936"/>
             <w:shd w:val="clear" w:color="auto" w:fill="F2F4F8"/>
+          </w:tcPr>
+          <w:p>
+            <w:pPr>
+              <w:spacing w:after="0" w:before="0"/>
+            </w:pPr>
+            <w:r/>
+            <w:r>
+              <w:rPr>
+                <w:b w:val="0"/>
+                <w:i w:val="0"/>
+                <w:sz w:val="15"/>
+              </w:rPr>
+              <w:t>Medium</w:t>
+            </w:r>
+          </w:p>
+        </w:tc>
+      </w:tr>
+      <w:tr>
+        <w:tc>
+          <w:tcPr>
+            <w:tcW w:type="dxa" w:w="2880"/>
+          </w:tcPr>
+          <w:p>
+            <w:pPr>
+              <w:spacing w:after="0" w:before="0"/>
+            </w:pPr>
+            <w:r/>
+            <w:r>
+              <w:rPr>
+                <w:b w:val="0"/>
+                <w:i w:val="0"/>
+                <w:sz w:val="15"/>
+              </w:rPr>
+              <w:t>Trenton Channel Energy Center BESS</w:t>
+            </w:r>
+          </w:p>
+        </w:tc>
+        <w:tc>
+          <w:tcPr>
+            <w:tcW w:type="dxa" w:w="720"/>
+          </w:tcPr>
+          <w:p>
+            <w:pPr>
+              <w:spacing w:after="0" w:before="0"/>
+            </w:pPr>
+            <w:r/>
+            <w:r>
+              <w:rPr>
+                <w:b w:val="0"/>
+                <w:i w:val="0"/>
+                <w:sz w:val="15"/>
+              </w:rPr>
+              <w:t>MI</w:t>
+            </w:r>
+          </w:p>
+        </w:tc>
+        <w:tc>
+          <w:tcPr>
+            <w:tcW w:type="dxa" w:w="576"/>
+          </w:tcPr>
+          <w:p>
+            <w:pPr>
+              <w:spacing w:after="0" w:before="0"/>
+              <w:jc w:val="right"/>
+            </w:pPr>
+            <w:r/>
+            <w:r>
+              <w:rPr>
+                <w:b w:val="0"/>
+                <w:i w:val="0"/>
+                <w:sz w:val="15"/>
+              </w:rPr>
+              <w:t>220</w:t>
+            </w:r>
+          </w:p>
+        </w:tc>
+        <w:tc>
+          <w:tcPr>
+            <w:tcW w:type="dxa" w:w="648"/>
+          </w:tcPr>
+          <w:p>
+            <w:pPr>
+              <w:spacing w:after="0" w:before="0"/>
+              <w:jc w:val="right"/>
+            </w:pPr>
+            <w:r/>
+            <w:r>
+              <w:rPr>
+                <w:b w:val="0"/>
+                <w:i w:val="0"/>
+                <w:sz w:val="15"/>
+              </w:rPr>
+              <w:t>880</w:t>
+            </w:r>
+          </w:p>
+        </w:tc>
+        <w:tc>
+          <w:tcPr>
+            <w:tcW w:type="dxa" w:w="648"/>
+          </w:tcPr>
+          <w:p>
+            <w:pPr>
+              <w:spacing w:after="0" w:before="0"/>
+              <w:jc w:val="right"/>
+            </w:pPr>
+            <w:r/>
+            <w:r>
+              <w:rPr>
+                <w:b w:val="0"/>
+                <w:i w:val="0"/>
+                <w:sz w:val="15"/>
+              </w:rPr>
+              <w:t>2026</w:t>
+            </w:r>
+          </w:p>
+        </w:tc>
+        <w:tc>
+          <w:tcPr>
+            <w:tcW w:type="dxa" w:w="1008"/>
+          </w:tcPr>
+          <w:p>
+            <w:pPr>
+              <w:spacing w:after="0" w:before="0"/>
+              <w:jc w:val="right"/>
+            </w:pPr>
+            <w:r/>
+            <w:r>
+              <w:rPr>
+                <w:b w:val="0"/>
+                <w:i w:val="0"/>
+                <w:sz w:val="15"/>
+              </w:rPr>
+              <w:t>$460.0M</w:t>
+            </w:r>
+          </w:p>
+        </w:tc>
+        <w:tc>
+          <w:tcPr>
+            <w:tcW w:type="dxa" w:w="864"/>
+          </w:tcPr>
+          <w:p>
+            <w:pPr>
+              <w:spacing w:after="0" w:before="0"/>
+              <w:jc w:val="right"/>
+            </w:pPr>
+            <w:r/>
+            <w:r>
+              <w:rPr>
+                <w:b w:val="0"/>
+                <w:i w:val="0"/>
+                <w:sz w:val="15"/>
+              </w:rPr>
+              <w:t>$523</w:t>
+            </w:r>
+          </w:p>
+        </w:tc>
+        <w:tc>
+          <w:tcPr>
+            <w:tcW w:type="dxa" w:w="1944"/>
+          </w:tcPr>
+          <w:p>
+            <w:pPr>
+              <w:spacing w:after="0" w:before="0"/>
+            </w:pPr>
+            <w:r/>
+            <w:r>
+              <w:rPr>
+                <w:b w:val="0"/>
+                <w:i w:val="0"/>
+                <w:sz w:val="15"/>
+              </w:rPr>
+              <w:t>approved estimate (MPSC, 2024)</w:t>
+            </w:r>
+          </w:p>
+        </w:tc>
+        <w:tc>
+          <w:tcPr>
+            <w:tcW w:type="dxa" w:w="936"/>
+          </w:tcPr>
+          <w:p>
+            <w:pPr>
+              <w:spacing w:after="0" w:before="0"/>
+            </w:pPr>
+            <w:r/>
+            <w:r>
+              <w:rPr>
+                <w:b w:val="0"/>
+                <w:i w:val="0"/>
+                <w:sz w:val="15"/>
+              </w:rPr>
+              <w:t>Medium</w:t>
+            </w:r>
+          </w:p>
+        </w:tc>
+      </w:tr>
+      <w:tr>
+        <w:tc>
+          <w:tcPr>
+            <w:tcW w:type="dxa" w:w="2880"/>
+            <w:shd w:val="clear" w:color="auto" w:fill="F2F4F8"/>
+          </w:tcPr>
+          <w:p>
+            <w:pPr>
+              <w:spacing w:after="0" w:before="0"/>
+            </w:pPr>
+            <w:r/>
+            <w:r>
+              <w:rPr>
+                <w:b w:val="0"/>
+                <w:i w:val="0"/>
+                <w:sz w:val="15"/>
+              </w:rPr>
+              <w:t>Oneida Energy Storage [CANADA]</w:t>
+            </w:r>
+          </w:p>
+        </w:tc>
+        <w:tc>
+          <w:tcPr>
+            <w:tcW w:type="dxa" w:w="720"/>
+            <w:shd w:val="clear" w:color="auto" w:fill="F2F4F8"/>
+          </w:tcPr>
+          <w:p>
+            <w:pPr>
+              <w:spacing w:after="0" w:before="0"/>
+            </w:pPr>
+            <w:r/>
+            <w:r>
+              <w:rPr>
+                <w:b w:val="0"/>
+                <w:i w:val="0"/>
+                <w:sz w:val="15"/>
+              </w:rPr>
+              <w:t>ON (Canada)</w:t>
+            </w:r>
+          </w:p>
+        </w:tc>
+        <w:tc>
+          <w:tcPr>
+            <w:tcW w:type="dxa" w:w="576"/>
+            <w:shd w:val="clear" w:color="auto" w:fill="F2F4F8"/>
+          </w:tcPr>
+          <w:p>
+            <w:pPr>
+              <w:spacing w:after="0" w:before="0"/>
+              <w:jc w:val="right"/>
+            </w:pPr>
+            <w:r/>
+            <w:r>
+              <w:rPr>
+                <w:b w:val="0"/>
+                <w:i w:val="0"/>
+                <w:sz w:val="15"/>
+              </w:rPr>
+              <w:t>250</w:t>
+            </w:r>
+          </w:p>
+        </w:tc>
+        <w:tc>
+          <w:tcPr>
+            <w:tcW w:type="dxa" w:w="648"/>
+            <w:shd w:val="clear" w:color="auto" w:fill="F2F4F8"/>
+          </w:tcPr>
+          <w:p>
+            <w:pPr>
+              <w:spacing w:after="0" w:before="0"/>
+              <w:jc w:val="right"/>
+            </w:pPr>
+            <w:r/>
+            <w:r>
+              <w:rPr>
+                <w:b w:val="0"/>
+                <w:i w:val="0"/>
+                <w:sz w:val="15"/>
+              </w:rPr>
+              <w:t>1000</w:t>
+            </w:r>
+          </w:p>
+        </w:tc>
+        <w:tc>
+          <w:tcPr>
+            <w:tcW w:type="dxa" w:w="648"/>
+            <w:shd w:val="clear" w:color="auto" w:fill="F2F4F8"/>
+          </w:tcPr>
+          <w:p>
+            <w:pPr>
+              <w:spacing w:after="0" w:before="0"/>
+              <w:jc w:val="right"/>
+            </w:pPr>
+            <w:r/>
+            <w:r>
+              <w:rPr>
+                <w:b w:val="0"/>
+                <w:i w:val="0"/>
+                <w:sz w:val="15"/>
+              </w:rPr>
+              <w:t>2025</w:t>
+            </w:r>
+          </w:p>
+        </w:tc>
+        <w:tc>
+          <w:tcPr>
+            <w:tcW w:type="dxa" w:w="1008"/>
+            <w:shd w:val="clear" w:color="auto" w:fill="F2F4F8"/>
+          </w:tcPr>
+          <w:p>
+            <w:pPr>
+              <w:spacing w:after="0" w:before="0"/>
+              <w:jc w:val="right"/>
+            </w:pPr>
+            <w:r/>
+            <w:r>
+              <w:rPr>
+                <w:b w:val="0"/>
+                <w:i w:val="0"/>
+                <w:sz w:val="15"/>
+              </w:rPr>
+              <w:t>$511.0M</w:t>
+            </w:r>
+          </w:p>
+        </w:tc>
+        <w:tc>
+          <w:tcPr>
+            <w:tcW w:type="dxa" w:w="864"/>
+            <w:shd w:val="clear" w:color="auto" w:fill="F2F4F8"/>
+          </w:tcPr>
+          <w:p>
+            <w:pPr>
+              <w:spacing w:after="0" w:before="0"/>
+              <w:jc w:val="right"/>
+            </w:pPr>
+            <w:r/>
+            <w:r>
+              <w:rPr>
+                <w:b w:val="0"/>
+                <w:i w:val="0"/>
+                <w:sz w:val="15"/>
+              </w:rPr>
+              <w:t>$511</w:t>
+            </w:r>
+          </w:p>
+        </w:tc>
+        <w:tc>
+          <w:tcPr>
+            <w:tcW w:type="dxa" w:w="1944"/>
+            <w:shd w:val="clear" w:color="auto" w:fill="F2F4F8"/>
+          </w:tcPr>
+          <w:p>
+            <w:pPr>
+              <w:spacing w:after="0" w:before="0"/>
+            </w:pPr>
+            <w:r/>
+            <w:r>
+              <w:rPr>
+                <w:b w:val="0"/>
+                <w:i w:val="0"/>
+                <w:sz w:val="15"/>
+              </w:rPr>
+              <w:t xml:space="preserve">final/actual (reported ~C$700M vs </w:t>
+            </w:r>
+          </w:p>
+        </w:tc>
+        <w:tc>
+          <w:tcPr>
+            <w:tcW w:type="dxa" w:w="936"/>
+            <w:shd w:val="clear" w:color="auto" w:fill="F2F4F8"/>
+          </w:tcPr>
+          <w:p>
+            <w:pPr>
+              <w:spacing w:after="0" w:before="0"/>
+            </w:pPr>
+            <w:r/>
+            <w:r>
+              <w:rPr>
+                <w:b w:val="0"/>
+                <w:i w:val="0"/>
+                <w:sz w:val="15"/>
+              </w:rPr>
+              <w:t>High</w:t>
+            </w:r>
+          </w:p>
+        </w:tc>
+      </w:tr>
+      <w:tr>
+        <w:tc>
+          <w:tcPr>
+            <w:tcW w:type="dxa" w:w="2880"/>
+          </w:tcPr>
+          <w:p>
+            <w:pPr>
+              <w:spacing w:after="0" w:before="0"/>
+            </w:pPr>
+            <w:r/>
+            <w:r>
+              <w:rPr>
+                <w:b w:val="0"/>
+                <w:i w:val="0"/>
+                <w:sz w:val="15"/>
+              </w:rPr>
+              <w:t>SCE substation BESS portfolio (Springvale 22</w:t>
+            </w:r>
+          </w:p>
+        </w:tc>
+        <w:tc>
+          <w:tcPr>
+            <w:tcW w:type="dxa" w:w="720"/>
+          </w:tcPr>
+          <w:p>
+            <w:pPr>
+              <w:spacing w:after="0" w:before="0"/>
+            </w:pPr>
+            <w:r/>
+            <w:r>
+              <w:rPr>
+                <w:b w:val="0"/>
+                <w:i w:val="0"/>
+                <w:sz w:val="15"/>
+              </w:rPr>
+              <w:t>CA</w:t>
+            </w:r>
+          </w:p>
+        </w:tc>
+        <w:tc>
+          <w:tcPr>
+            <w:tcW w:type="dxa" w:w="576"/>
+          </w:tcPr>
+          <w:p>
+            <w:pPr>
+              <w:spacing w:after="0" w:before="0"/>
+              <w:jc w:val="right"/>
+            </w:pPr>
+            <w:r/>
+            <w:r>
+              <w:rPr>
+                <w:b w:val="0"/>
+                <w:i w:val="0"/>
+                <w:sz w:val="15"/>
+              </w:rPr>
+              <w:t>537</w:t>
+            </w:r>
+          </w:p>
+        </w:tc>
+        <w:tc>
+          <w:tcPr>
+            <w:tcW w:type="dxa" w:w="648"/>
+          </w:tcPr>
+          <w:p>
+            <w:pPr>
+              <w:spacing w:after="0" w:before="0"/>
+              <w:jc w:val="right"/>
+            </w:pPr>
+            <w:r/>
+            <w:r>
+              <w:rPr>
+                <w:b w:val="0"/>
+                <w:i w:val="0"/>
+                <w:sz w:val="15"/>
+              </w:rPr>
+              <w:t>2150</w:t>
+            </w:r>
+          </w:p>
+        </w:tc>
+        <w:tc>
+          <w:tcPr>
+            <w:tcW w:type="dxa" w:w="648"/>
+          </w:tcPr>
+          <w:p>
+            <w:pPr>
+              <w:spacing w:after="0" w:before="0"/>
+              <w:jc w:val="right"/>
+            </w:pPr>
+            <w:r/>
+            <w:r>
+              <w:rPr>
+                <w:b w:val="0"/>
+                <w:i w:val="0"/>
+                <w:sz w:val="15"/>
+              </w:rPr>
+              <w:t>2022</w:t>
+            </w:r>
+          </w:p>
+        </w:tc>
+        <w:tc>
+          <w:tcPr>
+            <w:tcW w:type="dxa" w:w="1008"/>
+          </w:tcPr>
+          <w:p>
+            <w:pPr>
+              <w:spacing w:after="0" w:before="0"/>
+              <w:jc w:val="right"/>
+            </w:pPr>
+            <w:r/>
+            <w:r>
+              <w:rPr>
+                <w:b w:val="0"/>
+                <w:i w:val="0"/>
+                <w:sz w:val="15"/>
+              </w:rPr>
+              <w:t>$1,226.0M</w:t>
+            </w:r>
+          </w:p>
+        </w:tc>
+        <w:tc>
+          <w:tcPr>
+            <w:tcW w:type="dxa" w:w="864"/>
+          </w:tcPr>
+          <w:p>
+            <w:pPr>
+              <w:spacing w:after="0" w:before="0"/>
+              <w:jc w:val="right"/>
+            </w:pPr>
+            <w:r/>
+            <w:r>
+              <w:rPr>
+                <w:b w:val="0"/>
+                <w:i w:val="0"/>
+                <w:sz w:val="15"/>
+              </w:rPr>
+              <w:t>$570</w:t>
+            </w:r>
+          </w:p>
+        </w:tc>
+        <w:tc>
+          <w:tcPr>
+            <w:tcW w:type="dxa" w:w="1944"/>
+          </w:tcPr>
+          <w:p>
+            <w:pPr>
+              <w:spacing w:after="0" w:before="0"/>
+            </w:pPr>
+            <w:r/>
+            <w:r>
+              <w:rPr>
+                <w:b w:val="0"/>
+                <w:i w:val="0"/>
+                <w:sz w:val="15"/>
+              </w:rPr>
+              <w:t>contract price (EPCM contract, CPU</w:t>
+            </w:r>
+          </w:p>
+        </w:tc>
+        <w:tc>
+          <w:tcPr>
+            <w:tcW w:type="dxa" w:w="936"/>
           </w:tcPr>
           <w:p>
             <w:pPr>
@@ -5225,7 +5768,7 @@
           <w:b w:val="0"/>
           <w:i w:val="0"/>
         </w:rPr>
-        <w:t>A second review comment noted that New York has built many more projects of this size, most of them by NineDot Energy. NineDot reports eleven operating projects at six New York City sites (39 MW, September 2026) and closed $431 million of construction, tax-credit bridge and letter-of-credit financing in February 2026 for 28 further sites totaling 124 MW and 494 MWh. Three New York City Industrial Development Agency filings disclose all-in project costs: NineDot's Arthur Kill Road site (9.8 MW, 39.1 MWh, $43.4 million, $1,110 per kWh, $4,427 per kW), Elevate Renewables' Victory Boulevard site at an existing generation property (15.1 MW, 60.4 MWh, $31.65 million, $524 per kWh) and Soltage's Maspeth site (5 MW, $16.1 million, $805 per kWh on an assumed four-hour duration). NYSERDA's 6 GW Roadmap reports average total installed costs for its retail-tier (5 MW and below) projects of $464 per kWh for 2020-21 installations and $567 for 2022-23. These are developer-owned, four-hour, distribution-connected sites on leased lots with VDER revenue, a NYSERDA incentive and the investment tax credit; none carries a utility switching station, a landfill platform, a siting case, utility indirects or AFUDC, and none of the figures nets the incentives. On a dollar-per-kW basis NineDot's own filed budget is 77 percent of Hyde Park's approval level and 1.5 times its station-complete direct cost. The cohort also illustrates the interconnection point: NY-BEST and NYSEIA told the Public Service Commission on 11 March 2026 (Case 24-E-0621) that Con Edison's two-part interconnection test had raised upgrade costs about fourteen-fold on 34 distributed projects totaling 161 MW, an average of about $21 million per project. The cohort is shown on deck slide 13 and on the workbook tab; it was not added to the regression, which was not re-run.</w:t>
+        <w:t>A second review comment noted that New York has built many more projects of this size, most of them by NineDot Energy. NineDot reports eleven operating projects at six New York City sites (39 MW, September 2026) and closed $431 million of construction, tax-credit bridge and letter-of-credit financing in February 2026 for 28 further sites totaling 124 MW and 494 MWh. Three New York City Industrial Development Agency filings disclose all-in project costs: NineDot's Arthur Kill Road site (9.8 MW, 39.1 MWh, $43.4 million, $1,110 per kWh, $4,427 per kW), Elevate Renewables' Victory Boulevard site at an existing generation property (15.1 MW, 60.4 MWh, $31.65 million, $524 per kWh) and Soltage's Maspeth site (5 MW, $16.1 million, $805 per kWh on an assumed four-hour duration). NYSERDA's 6 GW Roadmap reports average total installed costs for its retail-tier (5 MW and below) projects of $464 per kWh for 2020-21 installations and $567 for 2022-23. These are developer-owned, four-hour, distribution-connected sites on leased lots with VDER revenue, a NYSERDA incentive and the investment tax credit; none carries a utility switching station, a landfill platform, a siting case, utility indirects or AFUDC, and none of the figures nets the incentives. On a dollar-per-kW basis NineDot's own filed budget is 77 percent of Hyde Park's approval level and 1.5 times its station-complete direct cost. The cohort also illustrates the interconnection point: NY-BEST and NYSEIA told the Public Service Commission on 11 March 2026 (Case 24-E-0621) that Con Edison's two-part interconnection test had raised upgrade costs about fourteen-fold on 34 distributed projects totaling 161 MW, an average of about $21 million per project. The cohort is shown on deck slide 13 and on the workbook tab. The three NYCIDA-costed projects were added to the regression dataset and the model re-run (n = 29): the size elasticity is unchanged at -0.17 and its p-value falls from 0.012 to 0.001; the duration elasticity is -0.29; the year term stays insignificant; R-squared falls from 0.65 to 0.63 as three near-identical-size projects with a 2.1x cost spread enter; the prediction for 20 MWh, two hours, 2028 moves from $1,116 to $1,114 per kWh and the 80 percent interval narrows from $611 to $2,037 to $652 to $1,903. Hyde Park's station-complete direct cost sits at the 75th percentile of the predictive distribution (73rd before). The financing floor and the NYSERDA program averages are not project costs and were not added.</w:t>
       </w:r>
     </w:p>
     <w:p>
@@ -5245,7 +5788,7 @@
           <w:b w:val="0"/>
           <w:i w:val="0"/>
         </w:rPr>
-        <w:t>A log-log ordinary least squares model was fitted with heteroskedasticity-robust standard errors: ln($/kWh) on ln(MWh), ln(duration in hours) and calendar year. Results for the 26 projects: R-squared 0.65 (adjusted 0.60); size elasticity -0.17 (p = 0.012), so a tenfold increase in MWh lowers $/kWh by about 33 percent; duration elasticity -0.29 (p = 0.016), so doubling duration lowers $/kWh by about 18 percent, close to the 38 percent that Modo Energy's September 2026 survey reports for two-hour versus four-hour systems; and a year effect that is not distinguishable from zero (p = 0.68), which is what one expects when falling pack prices and rising installation, interconnection and tariff costs offset over the period. Adding ownership and Northeast dummies changes nothing of substance (R-squared 0.66, both p above 0.5), so the parsimonious model is used. The residual standard deviation of 0.36 in log terms means that a project of given size and duration lands within a factor of about 1.43 of the fitted value two times in three.</w:t>
+        <w:t>A log-log ordinary least squares model was fitted with heteroskedasticity-robust standard errors: ln($/kWh) on ln(MWh), ln(duration in hours) and calendar year. Results for the 29 projects: R-squared 0.63 (adjusted 0.58); size elasticity -0.17 (p = 0.001), so a tenfold increase in MWh lowers $/kWh by about 33 percent; duration elasticity -0.29 (p = 0.012), so doubling duration lowers $/kWh by about 18 percent, close to the 38 percent that Modo Energy's September 2026 survey reports for two-hour versus four-hour systems; and a year effect that is not distinguishable from zero (p = 0.62), which is what one expects when falling pack prices and rising installation, interconnection and tariff costs offset over the period. Adding ownership and Northeast dummies changes nothing of substance (R-squared 0.64, both p above 0.5), so the parsimonious model is used. The residual standard deviation of 0.35 in log terms means that a project of given size and duration lands within a factor of about 1.42 of the fitted value two times in three.</w:t>
       </w:r>
     </w:p>
     <w:p>
@@ -5257,7 +5800,7 @@
           <w:b w:val="0"/>
           <w:i w:val="0"/>
         </w:rPr>
-        <w:t>For a 20 MWh, two-hour project in 2028 the fitted value is $1,116/kWh and the 80 percent prediction interval is $611 to $2,037/kWh. Hyde Park's boundaries fall at the following percentiles of that predictive distribution: vendor contract 10%, installed battery 27%, station complete direct 73%, approval level 98%. The reading is direct. The battery is priced below what the population would predict for a project this small and this short. The station, complete and unloaded, is a high-normal outcome. The approval level is an outlier against public disclosures, and the memo's position is that the outlier is explained by scope that the disclosures do not carry rather than by pricing.</w:t>
+        <w:t>For a 20 MWh, two-hour project in 2028 the fitted value is $1,114/kWh and the 80 percent prediction interval is $652 to $1,903/kWh. Hyde Park's boundaries fall at the following percentiles of that predictive distribution: vendor contract 7%, installed battery 24%, station complete direct 75%, approval level 99%. The reading is direct. The battery is priced below what the population would predict for a project this small and this short. The station, complete and unloaded, is a high-normal outcome. The approval level is an outlier against public disclosures, and the memo's position is that the outlier is explained by scope that the disclosures do not carry rather than by pricing.</w:t>
       </w:r>
     </w:p>
     <w:p>

</xml_diff>